<commit_message>
Defense v6 script: add theory and statistical-method reference sections; fix Jaccard period wording
Co-Authored-By: Claude Opus 5.5 <noreply@anthropic.com>
Claude-Session: https://claude.ai/code/session_01SvckvZxt3hAXTDPnm8YPEC
</commit_message>
<xml_diff>
--- a/defense/defense_final_v6_20min_대본.docx
+++ b/defense/defense_final_v6_20min_대본.docx
@@ -493,7 +493,7 @@
         <w:spacing w:after="200"/>
       </w:pPr>
       <w:r>
-        <w:t>수치로 보면 웨이퍼 제조공정의 결합 강도는 0.598에서 0.159로 낮아졌지만, 공정 장치는 0.046에서 0.176으로, 패키징 단계 공정은 0.194에서 0.268로 높아졌습니다. 매개 중심성도 웨이퍼 제조공정은 53.6%에서 9.0%로 낮아지고 공정 장치는 0.0%에서 26.1%로 높아졌습니다. 이것이 세 번째 연구 질문의 답입니다. 융합의 중심은 웨이퍼 제조공정에서 공정 장치와 패키징 단계 공정으로 옮겨 갔습니다.</w:t>
+        <w:t>수치로 보면 웨이퍼 제조공정의 결합 강도는 확산기 0.598에서 재편기 0.159로 크게 낮아진 반면, 공정 장치는 0.046에서 0.176으로, 패키징 단계 공정은 0.194에서 0.268로 세 시기 내내 꾸준히 높아졌습니다. 매개 중심성도 형성기에서 재편기 사이에 웨이퍼 제조공정은 53.6%에서 9.0%로 낮아지고 공정 장치는 0.0%에서 26.1%로 높아졌습니다. 이것이 세 번째 연구 질문의 답입니다. 융합의 중심은 웨이퍼 제조공정에서 공정 장치와 패키징 단계 공정으로 옮겨 갔습니다.</w:t>
       </w:r>
     </w:p>
     <w:p>
@@ -760,6 +760,499 @@
       </w:pPr>
       <w:r>
         <w:t>핵심 기술을 어떻게 정했는지 묻는 질문에 쓰는 슬라이드입니다. 먼저 기술 클러스터 분석으로 출원에 자주 부여된 기호를 찾았습니다. 왼쪽 표처럼 접합 패드를 이용한 연결 방법인 24/80이 529건, 연결 후 접합 패드의 구조인 24/08이 513건으로 가장 많고, 구리끼리와 산화막끼리의 직접 접합 기호가 뒤를 잇습니다. 다음으로 기술 네트워크 분석으로 기호 사이의 연결 구조를 확인했습니다. 오른쪽 표처럼 가장 강하게 연결된 기호 쌍도 직접 접합과 접합 패드 기호로 이루어져 있습니다.</w:t>
+      </w:r>
+    </w:p>
+    <w:p>
+      <w:pPr>
+        <w:spacing w:after="200"/>
+      </w:pPr>
+      <w:r>
+        <w:br w:type="page"/>
+      </w:r>
+    </w:p>
+    <w:p>
+      <w:pPr>
+        <w:keepNext/>
+        <w:spacing w:after="40"/>
+      </w:pPr>
+      <w:r>
+        <w:rPr>
+          <w:b/>
+          <w:sz w:val="28"/>
+        </w:rPr>
+        <w:t>[참고 1] 이론적 배경 논문의 핵심 모형과 핵심 내용</w:t>
+      </w:r>
+    </w:p>
+    <w:p>
+      <w:pPr>
+        <w:keepNext/>
+        <w:spacing w:after="40"/>
+      </w:pPr>
+      <w:r>
+        <w:rPr>
+          <w:b/>
+        </w:rPr>
+        <w:t>■ 이론 구성의 큰 그림</w:t>
+      </w:r>
+    </w:p>
+    <w:p>
+      <w:pPr>
+        <w:spacing w:after="200"/>
+      </w:pPr>
+      <w:r>
+        <w:t>본 연구의 이론은 세 축으로 구성됩니다. ① 기술융합 이론(Rosenberg, Kodama, Hacklin)은 "융합이 무엇이고 어떤 단계를 거치는가"를, ② 수직 전문화와 지식 경계 이론(Macher &amp; Mowery, Kapoor &amp; Adner, Brusoni et al., Jacobides et al.)은 "왜 한 산업의 공정 단계 사이에서 융합이 생기는가"를, ③ 기술 순환과 핵심–주변 이론(Anderson &amp; Tushman, Murmann &amp; Frenken, Henderson &amp; Clark)은 "융합의 중심이 시간에 따라 왜 이동하는가"를 설명합니다. 측정의 근거는 Fleming(재조합), Lerner(특허 범위), Curran &amp; Leker(특허 기반 융합 측정), Breschi et al.·Sternitzke et al.(기술 네트워크)입니다. ①→RQ1, ①+③→RQ2, ②+③→RQ3로 연결됩니다.</w:t>
+      </w:r>
+    </w:p>
+    <w:p>
+      <w:pPr>
+        <w:spacing w:after="40"/>
+      </w:pPr>
+      <w:r>
+        <w:rPr>
+          <w:b/>
+        </w:rPr>
+        <w:t>1. Rosenberg (1963) — 기술적 수렴(Technological Convergence)</w:t>
+      </w:r>
+    </w:p>
+    <w:p>
+      <w:pPr>
+        <w:spacing w:after="200"/>
+      </w:pPr>
+      <w:r>
+        <w:t>핵심 모형: 19세기 미국 공작기계 산업의 형성 과정. 총기, 재봉틀, 자전거처럼 서로 다른 제품을 만드는 산업들이 절삭, 연삭, 천공 같은 공통의 금속가공 공정을 쓰게 되면서, 한 산업에서 해결된 공정 문제가 다른 산업으로 전파되었습니다. 핵심 내용: 수렴이 일어나는 단위는 최종 제품이 아니라 생산공정이며, 이 공정 지식을 축적한 공작기계(장비) 산업이 독립된 전문 산업으로 등장했습니다. 본 연구 적용: 하이브리드 본딩에서도 전공정과 후공정이 증착, 식각, 도금, CMP라는 공통의 공정과 장비를 공유합니다. 재편기에 접합과 제조공정을 잇는 연결 기호가 "공정 장치"로 바뀐 결과는, 장비를 매개로 공정 지식이 확산된다는 Rosenberg의 관찰과 맥을 같이합니다.</w:t>
+      </w:r>
+    </w:p>
+    <w:p>
+      <w:pPr>
+        <w:spacing w:after="40"/>
+      </w:pPr>
+      <w:r>
+        <w:rPr>
+          <w:b/>
+        </w:rPr>
+        <w:t>2. Kodama (1992) — 기술융합(Technology Fusion)</w:t>
+      </w:r>
+    </w:p>
+    <w:p>
+      <w:pPr>
+        <w:spacing w:after="200"/>
+      </w:pPr>
+      <w:r>
+        <w:t>핵심 모형: 돌파형 혁신(breakthrough, 기존 기술을 새 기술로 대체)과 기술융합(fusion, 기존 기술들을 결합)의 구분. 핵심 내용: 일본 기업 사례에서, 분리되어 있던 기술 분야들을 결합하면 어느 한 분야도 단독으로 갖지 못한 역량이 창출되며, 메카트로닉스(기계+전자)와 광전자공학(광학+전자)이 대표적 예입니다. 본 연구 적용: 10 µm 이하 연결 간격은 접합 기술만으로도, 제조공정 기술만으로도 불가능하고 두 영역의 결합으로만 달성됩니다. 따라서 하이브리드 본딩은 Kodama의 기술융합을 한 산업 내부의 공정 경계에 적용한 사례입니다.</w:t>
+      </w:r>
+    </w:p>
+    <w:p>
+      <w:pPr>
+        <w:spacing w:after="40"/>
+      </w:pPr>
+      <w:r>
+        <w:rPr>
+          <w:b/>
+        </w:rPr>
+        <w:t>3. Hacklin et al. (2009, 2010) — 융합의 단계 모형(Stage Model of Convergence)</w:t>
+      </w:r>
+    </w:p>
+    <w:p>
+      <w:pPr>
+        <w:spacing w:after="200"/>
+      </w:pPr>
+      <w:r>
+        <w:t>핵심 모형: 지식 융합 → 기술 융합 → 응용 융합 → 산업 융합의 4단계. 정보통신 분야 기업 사례에서 귀납적으로 도출되었고, 각 단계가 상호 피드백을 통해 공진화적 순환을 이룬다고 봅니다(2009년 논문은 이를 혁신 순환 모형에 기초해 설명). 핵심 내용: 융합은 한 번의 사건이 아니라 단계적 과정이며, 단계마다 현상의 수준이 달라 관찰에 적합한 자료도 다릅니다. 본 연구 적용: 특허 공동분류로 직접 관찰할 수 있는 것은 "기술 융합" 단계입니다. 형성기는 지식 융합, 확산기는 기술 융합, 재편기의 주변 공정 이동은 응용 융합으로 대응시켰고, 산업 융합은 분석 범위 밖입니다. 참고로 Curran &amp; Leker(2011)는 이 단계를 과학→기술→시장→산업 순서의 특허·논문 지표로 관찰하는 방법을 제안했으며, 융합이 비선형적으로 진행될 수 있다고 지적했습니다.</w:t>
+      </w:r>
+    </w:p>
+    <w:p>
+      <w:pPr>
+        <w:spacing w:after="40"/>
+      </w:pPr>
+      <w:r>
+        <w:rPr>
+          <w:b/>
+        </w:rPr>
+        <w:t>4. Macher &amp; Mowery (2004) — 반도체 산업의 수직 전문화</w:t>
+      </w:r>
+    </w:p>
+    <w:p>
+      <w:pPr>
+        <w:spacing w:after="200"/>
+      </w:pPr>
+      <w:r>
+        <w:t>핵심 모형: 반도체 산업에서 설계와 제조, 제조와 조립이 분리되며 팹리스, 파운드리, 조립·테스트 전문업체(OSAT)가 등장한 수직 전문화 과정. 핵심 내용: 이러한 분업은 공정 단계 사이의 인터페이스가 안정적이고 표준화되어 있을 때 가능합니다. 본 연구 적용: 반세기 넘게 유지된 전공정–후공정 분업이 하이브리드 본딩으로 인해 흔들리고 있다는 문제 제기의 출발점입니다.</w:t>
+      </w:r>
+    </w:p>
+    <w:p>
+      <w:pPr>
+        <w:spacing w:after="40"/>
+      </w:pPr>
+      <w:r>
+        <w:rPr>
+          <w:b/>
+        </w:rPr>
+        <w:t>5. Kapoor &amp; Adner (2012) — 생산의 경계 ≠ 지식의 경계</w:t>
+      </w:r>
+    </w:p>
+    <w:p>
+      <w:pPr>
+        <w:spacing w:after="200"/>
+      </w:pPr>
+      <w:r>
+        <w:t>핵심 모형: 1974–2005년 세계 DRAM 산업의 12개 제품 세대를 분석하여, 기술 변화를 구성요소의 변화와 아키텍처의 변화로 구분하고 기업의 수직 통합 여부와 지식 범위에 따른 기술 전환 성과를 비교했습니다. 핵심 내용: 부품과 시스템이 상호의존적일 때, 외주화한 구성요소에 대한 지식까지 보유한 비통합 기업이 기술 전환에서 성과 우위를 얻었습니다. 즉 "무엇을 만드는가"와 "무엇을 아는가"는 다르며, 기술 변화 국면에서는 그 차이가 대응 능력을 좌우합니다. 본 연구 적용: 인터페이스가 불안정해지면 지식 경계가 먼저 넓어지고, 그 흔적은 두 단계의 기술을 함께 담은 발명(통합형)으로 나타날 것이라는 RQ1의 이론적 기대의 근거입니다.</w:t>
+      </w:r>
+    </w:p>
+    <w:p>
+      <w:pPr>
+        <w:spacing w:after="40"/>
+      </w:pPr>
+      <w:r>
+        <w:rPr>
+          <w:b/>
+        </w:rPr>
+        <w:t>6. Brusoni, Prencipe &amp; Pavitt (2001) — 기업은 왜 만드는 것보다 더 많이 아는가</w:t>
+      </w:r>
+    </w:p>
+    <w:p>
+      <w:pPr>
+        <w:spacing w:after="200"/>
+      </w:pPr>
+      <w:r>
+        <w:t>핵심 모형: 항공기 엔진 제어 시스템의 디지털화 사례. 시스템 통합 기업이 외부에서 조달하는 구성요소에 대한 지식까지 유지하는 이유를 분석했습니다. 핵심 내용: 구성요소 기술이 서로 다른 속도로 발전하여 상호의존을 예측하기 어려울수록, 기업은 직접 생산하는 범위보다 넓은 지식이 필요합니다. 본 연구 적용: 반대로 상호의존이 예측 가능해지면(설계가 고착화되면) 하나의 발명이 경계 반대편의 지식을 함께 담을 필요가 줄어듭니다. 이것이 RQ3에서 재편기에 핵심 기술의 "경계 넘기" 우위가 사라진 결과를 해석하는 논리입니다.</w:t>
+      </w:r>
+    </w:p>
+    <w:p>
+      <w:pPr>
+        <w:spacing w:after="40"/>
+      </w:pPr>
+      <w:r>
+        <w:rPr>
+          <w:b/>
+        </w:rPr>
+        <w:t>7. Jacobides, Knudsen &amp; Augier (2006) — 산업 아키텍처</w:t>
+      </w:r>
+    </w:p>
+    <w:p>
+      <w:pPr>
+        <w:spacing w:after="200"/>
+      </w:pPr>
+      <w:r>
+        <w:t>핵심 모형: 산업 아키텍처, 즉 산업 안에서 누가 무엇을 수행하고 가치가 어떻게 배분되는지를 규정하는 틀. 핵심 내용: 혁신에서 누가 이익을 얻는지는 개별 기업의 자산뿐 아니라 이 분업과 가치 배분의 틀에 의해 좌우되며, 그 틀 자체도 기술과 전략의 변화에 따라 재편될 수 있습니다. 본 연구 적용: 통합형 발명의 분포는 공정 단계 간 분업과 가치 배분의 틀이 재편될 수 있는 기술적 조건을 보여 줍니다(산업적 함의).</w:t>
+      </w:r>
+    </w:p>
+    <w:p>
+      <w:pPr>
+        <w:spacing w:after="40"/>
+      </w:pPr>
+      <w:r>
+        <w:rPr>
+          <w:b/>
+        </w:rPr>
+        <w:t>8. Anderson &amp; Tushman (1990) — 기술 순환 모형(Technology Cycle)</w:t>
+      </w:r>
+    </w:p>
+    <w:p>
+      <w:pPr>
+        <w:spacing w:after="200"/>
+      </w:pPr>
+      <w:r>
+        <w:t>핵심 모형: 기술적 불연속 → 격동기(era of ferment) → 지배적 설계(dominant design) → 점진적 변화(era of incremental change)의 순환. 시멘트, 유리, 미니컴퓨터 산업의 장기 자료로 실증했습니다. 핵심 내용: 격동기에는 새로운 기술 원리를 구현하는 여러 설계가 경쟁하고, 지배적 설계가 확립되면 혁신의 성격이 정해진 설계를 정교화하는 점진적 혁신으로 바뀝니다. 본 연구 적용: 출원 시기를 세 시기로 나눈 것은 기술 순환의 단계를 근사하기 위함입니다. 형성기·확산기는 격동기, 재편기는 지배적 설계 이후의 점진적 변화기로 해석했습니다(시기 구분의 방법론적 근거는 Lee et al., 2017).</w:t>
+      </w:r>
+    </w:p>
+    <w:p>
+      <w:pPr>
+        <w:spacing w:after="40"/>
+      </w:pPr>
+      <w:r>
+        <w:rPr>
+          <w:b/>
+        </w:rPr>
+        <w:t>9. Murmann &amp; Frenken (2006) — 핵심–주변 구조와 지배적 설계</w:t>
+      </w:r>
+    </w:p>
+    <w:p>
+      <w:pPr>
+        <w:spacing w:after="200"/>
+      </w:pPr>
+      <w:r>
+        <w:t>핵심 모형: 제품을 여러 하위 시스템의 기술 순환이 중첩된 위계로 보고, 구성요소를 다른 요소와 밀접하게 연관된 핵심 요소와 그렇지 않은 주변 요소로 구분합니다. 핵심 요소의 설계를 바꾸면 연관된 다른 요소도 함께 바뀌어야 합니다. 핵심 내용: 지배적 설계란 다른 요소와 안정된 인터페이스 역할을 하는 핵심 요소의 안정된 설계이며, 핵심이 안정된 이후의 변화는 그 인터페이스를 전제로 주변 요소에서 일어납니다. 본 연구 적용: 기술 네트워크에서 다른 기호와 가장 강하게 연결된 접합 패드 기호 4개를 "핵심 기술"로 정의한 것이 이 관점을 특허 분류에서 근사한 것이며, 재편기에 결합이 다이 지지·봉지 같은 주변 공정으로 이동한 결과의 해석 틀입니다.</w:t>
+      </w:r>
+    </w:p>
+    <w:p>
+      <w:pPr>
+        <w:keepNext/>
+        <w:spacing w:after="40"/>
+      </w:pPr>
+      <w:r>
+        <w:rPr>
+          <w:b/>
+        </w:rPr>
+        <w:t>10. Henderson &amp; Clark (1990) — 아키텍처 혁신</w:t>
+      </w:r>
+    </w:p>
+    <w:p>
+      <w:pPr>
+        <w:spacing w:after="200"/>
+      </w:pPr>
+      <w:r>
+        <w:t>핵심 모형: 구성요소 지식과 아키텍처(구성요소 간 연결) 지식을 두 축으로, 혁신을 점진적·모듈러·아키텍처·급진적 혁신의 네 유형으로 구분했습니다. 반도체 노광 정렬 장비 산업 사례로 실증했습니다. 핵심 내용: 지배적 설계가 확립되면 아키텍처 지식은 조직의 의사소통 경로와 문제 해결 방식에 내재되어 당연한 전제가 되므로, 기존 기업은 아키텍처 혁신에 취약합니다. 본 연구 적용: 재편기에 직접 접합의 원리가 "주어진 조건"이 되어 발명이 제조공정 지식을 매번 다룰 필요가 줄었다는 해석의 근거입니다.</w:t>
+      </w:r>
+    </w:p>
+    <w:p>
+      <w:pPr>
+        <w:keepNext/>
+        <w:spacing w:after="40"/>
+      </w:pPr>
+      <w:r>
+        <w:rPr>
+          <w:b/>
+        </w:rPr>
+        <w:t>11. 측정의 이론적 근거 — Fleming (2001), Lerner (1994), Breschi et al. (2003)</w:t>
+      </w:r>
+    </w:p>
+    <w:p>
+      <w:pPr>
+        <w:spacing w:after="200"/>
+      </w:pPr>
+      <w:r>
+        <w:t>Fleming(2001): 발명을 기존 기술 요소의 새로운 재조합으로 보고, 특허의 분류 기호를 기술 요소로, 한 특허에 함께 부여된 기호의 조합을 요소의 재조합으로 측정했습니다. 본 연구에서는 H01L21과 H01L24 기호가 한 출원에 함께 부여된 것을 두 영역 지식이 한 발명 안에서 결합된 흔적(통합형)으로 보는 근거입니다. Lerner(1994): 바이오 기업 특허를 대상으로 특허가 포괄하는 분류의 수로 특허 범위를 측정하고, 범위가 기업 가치와 관련됨을 보였습니다. 본 연구의 기술범위(breadth, 두 클래스 내 서로 다른 서브그룹 수)는 이 방식을 두 클래스 안으로 한정해 적용한 것입니다. Breschi et al.(2003)·Sternitzke et al.(2008): 분류 기호를 노드로, 함께 부여된 기호 쌍을 연결로 보는 기술 네트워크이며, 함께 부여되는 빈도는 두 기술 사이의 지식 관련성을 반영합니다. 핵심 기술 식별과 RQ3의 매개 중심성 분석의 근거입니다. 단, CPC 기호는 심사관이 기술 내용에 따라 부여하므로 공동분류는 대리측정치이며 법적 청구범위의 측정은 아닙니다.</w:t>
+      </w:r>
+    </w:p>
+    <w:p>
+      <w:pPr>
+        <w:spacing w:after="200"/>
+      </w:pPr>
+      <w:r>
+        <w:br w:type="page"/>
+      </w:r>
+    </w:p>
+    <w:p>
+      <w:pPr>
+        <w:keepNext/>
+        <w:spacing w:after="40"/>
+      </w:pPr>
+      <w:r>
+        <w:rPr>
+          <w:b/>
+          <w:sz w:val="28"/>
+        </w:rPr>
+        <w:t>[참고 2] RQ1–RQ3 통계 방법론: 무엇을, 왜, 어떻게 사용했는가</w:t>
+      </w:r>
+    </w:p>
+    <w:p>
+      <w:pPr>
+        <w:keepNext/>
+        <w:spacing w:after="40"/>
+      </w:pPr>
+      <w:r>
+        <w:rPr>
+          <w:b/>
+        </w:rPr>
+        <w:t>■ 공통 사항</w:t>
+      </w:r>
+    </w:p>
+    <w:p>
+      <w:pPr>
+        <w:spacing w:after="200"/>
+      </w:pPr>
+      <w:r>
+        <w:t>분석 단위는 특허출원(928건, 출원 식별자별 집계)입니다. 모든 모형에 출원청 더미(미국, 중국, PCT, EPO, 대만, 한국, 일본, 기타)를 통제변수로 넣었습니다. 출원청마다 심사 관행과 분류 부여 방식이 다를 수 있기 때문입니다. 종속변수가 범주형이므로 선형회귀(OLS) 대신 로짓 모형을 사용했습니다. 로짓은 예측확률을 0과 1 사이로 제한하고, 계수를 승산비(OR)나 상대위험비(RRR)로 해석할 수 있습니다. 계수는 인과효과가 아니라 관찰된 변수를 통제한 조건부 연관으로 해석합니다. 5% 유의수준을 쓰되 단일 p값에 의존하지 않고, 기준 모형, 대안 표본·정의, 군집 표준오차 전반에서 방향, 크기, 유의성이 일관되는지를 종합적으로 판단했습니다.</w:t>
+      </w:r>
+    </w:p>
+    <w:p>
+      <w:pPr>
+        <w:keepNext/>
+        <w:spacing w:after="40"/>
+      </w:pPr>
+      <w:r>
+        <w:rPr>
+          <w:b/>
+        </w:rPr>
+        <w:t>RQ1 ① 기술통계: 융합의 수준</w:t>
+      </w:r>
+    </w:p>
+    <w:p>
+      <w:pPr>
+        <w:spacing w:after="200"/>
+      </w:pPr>
+      <w:r>
+        <w:t>무엇을: 928건을 공동분류 유형으로 분류한 빈도와 비중입니다. 왜: "융합이 어느 정도로 나타나는가"는 먼저 분포로 답해야 하기 때문입니다. 어떻게: H01L24만 있으면 접합 단독형, H01L21만 있으면 공정 단독형, 둘 다 있으면 통합형으로 정의했습니다. 결과는 통합형 425건(45.8%), 접합 단독형 338건(36.4%), 공정 단독형 165건(17.8%)이며, 패키징 단계 공정을 제외한 좁은 정의에서도 통합형은 37.2%였습니다.</w:t>
+      </w:r>
+    </w:p>
+    <w:p>
+      <w:pPr>
+        <w:keepNext/>
+        <w:spacing w:after="40"/>
+      </w:pPr>
+      <w:r>
+        <w:rPr>
+          <w:b/>
+        </w:rPr>
+        <w:t>RQ1 ② 다항 로짓(Multinomial Logit) — 주모형</w:t>
+      </w:r>
+    </w:p>
+    <w:p>
+      <w:pPr>
+        <w:spacing w:after="200"/>
+      </w:pPr>
+      <w:r>
+        <w:t>무엇을: 종속변수는 공동분류 유형 3범주(기준 범주 = 접합 단독형)이고, 설명변수는 기술범위(breadth)와 출원연도(yc), 통제변수는 출원청입니다. 왜: 세 유형은 크기의 순서가 있는 범주가 아니라 서로 다른 CPC 구성 방식이므로 순서형 로짓이 아닌 다항 로짓(McFadden, 1974)을 썼습니다. 접합 단독형을 기준으로 두면, 접합 기호만 가진 출원에 대비해 제조공정이 함께 나타나는 통합형과 제조공정만 나타나는 공정 단독형의 상대적 발생 가능성을 각각 볼 수 있습니다. 어떻게: 결과는 상대위험비(RRR)로 보고합니다. 기술범위가 1 늘 때 통합형 RRR은 1.403(p&lt;0.01), 즉 상대위험이 40% 높아졌고, 공정 단독형은 0.905(p&lt;0.05)였습니다. RRR은 비율이라 직관적이지 않으므로, 관심 변수만 바꾸고 나머지는 각 출원의 관측값에 고정해 평균한 평균 예측확률을 함께 제시했습니다(기술범위 3 → 통합형 0.26, 8 → 0.68). 모형 적합도는 우도비 χ²(18)=367.4(p&lt;0.001), McFadden 의사 R² 0.192입니다.</w:t>
+      </w:r>
+    </w:p>
+    <w:p>
+      <w:pPr>
+        <w:keepNext/>
+        <w:spacing w:after="40"/>
+      </w:pPr>
+      <w:r>
+        <w:rPr>
+          <w:b/>
+        </w:rPr>
+        <w:t>RQ1 ③ 이항 로짓(Binary Logit) — 보완분석</w:t>
+      </w:r>
+    </w:p>
+    <w:p>
+      <w:pPr>
+        <w:spacing w:after="200"/>
+      </w:pPr>
+      <w:r>
+        <w:t>무엇을: 종속변수는 제조공정 분류 보유 여부(has_process; 통합형과 공정 단독형 = 1, 접합 단독형 = 0)이고, 설명변수는 다항 로짓과 같습니다. 왜: 어떤 특성의 출원에서 제조공정 지식이 전반적으로 관찰되는지를 단순한 두 범주로 확인해 주모형을 보완하기 위함입니다. 어떻게: 승산비(OR)로 보고합니다. 기술범위 OR 1.267(p&lt;0.01)로 세부 분류가 하나 늘 때 제조공정 기호를 가질 승산이 약 27% 높아졌습니다. OR은 확률이 아니라 승산의 배율이라는 점에 유의해야 합니다. 판별력 AUC 0.707은 수용 가능한 수준의 하단이고, McFadden 의사 R²는 0.100입니다.</w:t>
+      </w:r>
+    </w:p>
+    <w:p>
+      <w:pPr>
+        <w:keepNext/>
+        <w:spacing w:after="40"/>
+      </w:pPr>
+      <w:r>
+        <w:rPr>
+          <w:b/>
+        </w:rPr>
+        <w:t>RQ1 해석상 주의: 기술범위의 기계적 관계</w:t>
+      </w:r>
+    </w:p>
+    <w:p>
+      <w:pPr>
+        <w:spacing w:after="200"/>
+      </w:pPr>
+      <w:r>
+        <w:t>통합형은 정의상 두 클래스 기호를 하나 이상씩 가지므로 기술범위 최솟값이 2이고 단독형은 1입니다. 이 정의상 차이를 빼기 위해 유형 최소치 조정 범위(breadth_adj = breadth − H01L21 보유 − H01L24 보유)로 재추정했고, 통합형 RRR은 1.262로 방향이 유지되었습니다. 다만 이 지표도 유형 정보를 이용하므로 탐색적 강건성 분석으로만 사용했습니다.</w:t>
+      </w:r>
+    </w:p>
+    <w:p>
+      <w:pPr>
+        <w:keepNext/>
+        <w:spacing w:after="40"/>
+      </w:pPr>
+      <w:r>
+        <w:rPr>
+          <w:b/>
+        </w:rPr>
+        <w:t>RQ2 ① 시기별 유형 분포(교차표)</w:t>
+      </w:r>
+    </w:p>
+    <w:p>
+      <w:pPr>
+        <w:spacing w:after="200"/>
+      </w:pPr>
+      <w:r>
+        <w:t>무엇을: 세 시기(2014년 이전, 2015–2019년, 2020–2024년)별 유형 구성비입니다. 왜: 융합이 단선적으로 늘었는지, 단계에 따라 오르내렸는지는 시기별 구성 변화로 먼저 확인해야 하기 때문입니다. 시기 구분은 기술 순환 단계의 근사이며, 2014년 이전 47년간의 출원(179건)이 이후 5년간(209건)보다 적어 하나로 묶었습니다. 결과: 공정 단독형 43.6% → 14.8% → 10.4%, 통합형 31.3% → 62.2% → 44.3%, 접합 단독형 25.1% → 23.0% → 45.4%로, 형성기·확산기·재편기의 세 국면이 나타났습니다.</w:t>
+      </w:r>
+    </w:p>
+    <w:p>
+      <w:pPr>
+        <w:keepNext/>
+        <w:spacing w:after="40"/>
+      </w:pPr>
+      <w:r>
+        <w:rPr>
+          <w:b/>
+        </w:rPr>
+        <w:t>RQ2 ② 다항 로짓의 출원연도 계수와 기간 더미</w:t>
+      </w:r>
+    </w:p>
+    <w:p>
+      <w:pPr>
+        <w:spacing w:after="200"/>
+      </w:pPr>
+      <w:r>
+        <w:t>무엇을: RQ1과 같은 다항 로짓에서 출원연도(yc)의 계수를 봅니다. 추가로 연도 대신 기간 더미(기준 = 2014년 이전)를 넣은 모형도 추정했습니다. 왜: 교차표는 다른 요인(출원청, 기술범위)을 통제하지 못하므로, 통제한 상태에서도 시간 추세가 유지되는지를 확인하기 위함입니다. 기간 더미는 선형 추세로 잡히지 않는 오르내림을 보기 위해 썼습니다. 어떻게/결과: 공정 단독형 RRR 0.913(p&lt;0.01)으로 매년 약 8.7%씩 상대위험이 감소했고, 통합형은 전 기간 선형 추세가 유의하지 않았습니다(0.993). 평균 예측확률로 보면 2010 → 2022년에 공정 단독형 0.27 → 0.12, 접합 단독형 0.31 → 0.40입니다. 기간 더미 모형에서 통합형은 1.707(p=0.09)로 올랐다가 0.762(비유의)로 내려가 오르내림이 확인되었습니다. 이항 로짓에서도 연도 OR 0.946(p&lt;0.01)이었습니다. 결론은 출원의 무게중심이 제조공정에서 접합 쪽으로 이동했다는 것입니다.</w:t>
+      </w:r>
+    </w:p>
+    <w:p>
+      <w:pPr>
+        <w:keepNext/>
+        <w:spacing w:after="40"/>
+      </w:pPr>
+      <w:r>
+        <w:rPr>
+          <w:b/>
+        </w:rPr>
+        <w:t>RQ3 ① 핵심 기술의 식별 — 기술 클러스터와 기술 네트워크</w:t>
+      </w:r>
+    </w:p>
+    <w:p>
+      <w:pPr>
+        <w:spacing w:after="200"/>
+      </w:pPr>
+      <w:r>
+        <w:t>무엇을: 기술 클러스터(다수 출원에 공통으로 부여된 기호)와 기술 네트워크(노드 = CPC 기호, 연결 = 한 출원에 함께 부여된 기호 쌍, 가중치 = 함께 부여된 출원 수)입니다. 왜: RQ3는 "핵심 대 주변"을 다루므로 핵심 기술을 자의적이지 않게 정의해야 하기 때문입니다. 다른 요소와 가장 강하게 연결된 요소를 핵심으로 보는 Murmann &amp; Frenken의 관점을 특허 분류에서 근사한 것입니다. 어떻게: 출원 200건 이상에 부여된 H01L24 기호 네 개(24/80, 24/08, 24/05, 24/03)가 네트워크의 연결 강도 상위 4개(3,235, 3,140, 2,518, 1,778)와 일치했고, 이 네 기호의 6개 쌍이 가장 강한 6개 연결이었습니다. 모두 CPC 체계상 접합 패드 그룹입니다. 이 네 기호를 핵심 기술(core)로 정의했고, 접합 출원 763건의 81.3%가 핵심 기술을 포함합니다.</w:t>
+      </w:r>
+    </w:p>
+    <w:p>
+      <w:pPr>
+        <w:keepNext/>
+        <w:spacing w:after="40"/>
+      </w:pPr>
+      <w:r>
+        <w:rPr>
+          <w:b/>
+        </w:rPr>
+        <w:t>RQ3 ② 상호작용항을 포함한 이항 로짓 — 핵심 기술 모형</w:t>
+      </w:r>
+    </w:p>
+    <w:p>
+      <w:pPr>
+        <w:spacing w:after="200"/>
+      </w:pPr>
+      <w:r>
+        <w:t>무엇을: 표본은 H01L24를 가진 접합 출원 763건(통합형 425 + 접합 단독형 338), 종속변수는 통합형 여부, 설명변수는 핵심 기술 보유(core), 출원 시기(period), core × period 상호작용, 통제변수는 출원청입니다. 왜: 핵심 기술이 접합 기호로 정의되므로 공정 단독형은 정의상 핵심 기술을 가질 수 없어 표본을 접합 출원으로 한정했습니다. 그리고 "핵심 기술의 경계 넘기 우위가 시기에 따라 달라지는가"는 핵심 기술의 효과가 시기별로 다른지를 묻는 것이므로 상호작용항이 필요합니다. 어떻게: 추정식은 log[P/(1−P)] = β₀ + β₁·core + Σδ·period + Σθ·(core×period) + Σγ·출원청입니다. 시기별 핵심 기술 승산비는 2014년 이전 exp(β₁), 이후 시기는 exp(β₁+θ)이고, 95% 신뢰구간은 두 계수 합의 표준오차로, 표준오차는 이분산 강건 방식으로 구했습니다. 결과: 형성기 11.07(p&lt;0.01) → 확산기 2.45(p&lt;0.05) → 재편기 0.66(95% CI 0.374–1.160, 비유의). 두 상호작용의 결합 Wald 검정은 χ²(2)=26.43(p&lt;0.001)로 시기별 차이가 유의합니다. 해석은 재편기에 "우위가 없다는 것이 증명"된 것이 아니라 "우위가 확인되지 않았다"는 것입니다.</w:t>
+      </w:r>
+    </w:p>
+    <w:p>
+      <w:pPr>
+        <w:keepNext/>
+        <w:spacing w:after="40"/>
+      </w:pPr>
+      <w:r>
+        <w:rPr>
+          <w:b/>
+        </w:rPr>
+        <w:t>RQ3 ③ 보조 지표 — Jaccard 계수와 매개 중심성</w:t>
+      </w:r>
+    </w:p>
+    <w:p>
+      <w:pPr>
+        <w:spacing w:after="200"/>
+      </w:pPr>
+      <w:r>
+        <w:t>무엇을: 제조공정을 웨이퍼 제조공정, 공정 장치, 패키징 단계 공정의 세 영역으로 나누고, 시기별로 각 영역과 접합 기호의 결합 강도(Jaccard 계수)와 기술 네트워크의 매개 중심성을 계산했습니다. 왜: 회귀모형은 "우위가 줄었다"까지만 보여 주므로, 융합이 "어디로" 옮겨 갔는지를 보기 위함입니다. Jaccard 계수는 두 영역을 함께 가진 출원 수를 둘 중 하나라도 가진 출원 수로 나눈 값이라 영역별 출원 규모 차이가 보정됩니다(Jaccard, 1912). 매개 중심성은 다른 기호 쌍을 잇는 최단 경로 위에 그 기호가 놓이는 정도로, 두 영역을 잇는 "다리" 위치를 보여 줍니다(Freeman, 1977). 어떻게/결과: 웨이퍼 제조공정의 Jaccard 계수는 0.306 → 0.598 → 0.159(형성기 → 확산기 → 재편기)로 확산기에 정점을 찍고 크게 낮아진 반면, 공정 장치는 0.046 → 0.059 → 0.176, 패키징 단계 공정은 0.194 → 0.234 → 0.268로 꾸준히 높아졌습니다. 매개 중심성은 형성기 → 재편기에 웨이퍼 제조공정 53.6% → 9.0%, 공정 장치 0.0% → 26.1%, 패키징 단계 공정 0.3% → 7.3%였습니다. 허브(연결 강도 상위)는 세 시기 모두 핵심 기호(24/80, 24/08, 24/05)였습니다. 즉 핵심은 허브로 남고, 접합과 제조공정을 잇는 연결은 장치·패키징 공정으로 이동했습니다.</w:t>
+      </w:r>
+    </w:p>
+    <w:p>
+      <w:pPr>
+        <w:keepNext/>
+        <w:spacing w:after="40"/>
+      </w:pPr>
+      <w:r>
+        <w:rPr>
+          <w:b/>
+        </w:rPr>
+        <w:t>■ 강건성 검증 (질문 대비)</w:t>
+      </w:r>
+    </w:p>
+    <w:p>
+      <w:pPr>
+        <w:spacing w:after="200"/>
+      </w:pPr>
+      <w:r>
+        <w:t>① hybrid bonding 표본(467건): 넓은 검색어 direct bonding에 대한 의존 여부를 확인했습니다. ② 무관 용법 제외 표본: DBC 기판 등 68건을 제외했습니다. ③ 좁은 제조공정 정의: 패키징 단계 공정만 가진 통합형을 접합 단독형으로 재분류했습니다. ④ 동일 제목 중복 제거와 동일 제목 군집 표준오차: 패밀리 식별자가 없어 동일 제목으로 근사했으며, 군집 표준오차에서는 기술범위 → 공정 단독형만 유의성을 잃었습니다(p=0.29). ⑤ RQ3 모형에서는 핵심 기호 외 접합 기호 수를 통제하고, 핵심 기술을 가장 강한 쌍으로 한정해 보았습니다. ⑥ 다항 로짓의 IIA(무관 대안의 독립성) 가정은 정식 검정 대신, 공정 단독형을 뺀 표본에서 통합형 대 접합 단독형을 추정하는 대안 제외 민감도 분석으로 점검했습니다. 핵심 결론의 방향은 대체로 유지되었고, 유지되지 않은 부분(최다 유형이 정의에 따라 바뀌는 점 등)은 한계로 밝혔습니다.</w:t>
       </w:r>
     </w:p>
     <w:sectPr>

</xml_diff>